<commit_message>
Modify the Solution md file
</commit_message>
<xml_diff>
--- a/04_Coding_Activities/CA_11_4_Swagger_API/My_Solution/Required Coding Activity 11.4_Using Swagger to Expose an API.docx
+++ b/04_Coding_Activities/CA_11_4_Swagger_API/My_Solution/Required Coding Activity 11.4_Using Swagger to Expose an API.docx
@@ -30,7 +30,45 @@
         <w:t>”. Open the Terminal window in VS Code, and enter the following command:</w:t>
       </w:r>
     </w:p>
-    <w:p/>
+    <w:p>
+      <w:r>
+        <w:drawing>
+          <wp:inline distT="0" distB="0" distL="0" distR="0" wp14:anchorId="20006B7C" wp14:editId="3FFD3139">
+            <wp:extent cx="4712245" cy="2227241"/>
+            <wp:effectExtent l="0" t="0" r="0" b="1905"/>
+            <wp:docPr id="1669557090" name="Picture 1"/>
+            <wp:cNvGraphicFramePr>
+              <a:graphicFrameLocks xmlns:a="http://schemas.openxmlformats.org/drawingml/2006/main" noChangeAspect="1"/>
+            </wp:cNvGraphicFramePr>
+            <a:graphic xmlns:a="http://schemas.openxmlformats.org/drawingml/2006/main">
+              <a:graphicData uri="http://schemas.openxmlformats.org/drawingml/2006/picture">
+                <pic:pic xmlns:pic="http://schemas.openxmlformats.org/drawingml/2006/picture">
+                  <pic:nvPicPr>
+                    <pic:cNvPr id="1669557090" name=""/>
+                    <pic:cNvPicPr/>
+                  </pic:nvPicPr>
+                  <pic:blipFill>
+                    <a:blip r:embed="rId4"/>
+                    <a:stretch>
+                      <a:fillRect/>
+                    </a:stretch>
+                  </pic:blipFill>
+                  <pic:spPr>
+                    <a:xfrm>
+                      <a:off x="0" y="0"/>
+                      <a:ext cx="4722165" cy="2231930"/>
+                    </a:xfrm>
+                    <a:prstGeom prst="rect">
+                      <a:avLst/>
+                    </a:prstGeom>
+                  </pic:spPr>
+                </pic:pic>
+              </a:graphicData>
+            </a:graphic>
+          </wp:inline>
+        </w:drawing>
+      </w:r>
+    </w:p>
     <w:p>
       <w:r>
         <w:t>pip install flask-swagger-</w:t>
@@ -57,7 +95,36 @@
     <w:p/>
     <w:p>
       <w:r>
-        <w:t xml:space="preserve">Unzip the zip file Activity 11.4 Links to an external </w:t>
+        <w:rPr>
+          <w:b/>
+          <w:bCs/>
+        </w:rPr>
+        <w:t xml:space="preserve">Step </w:t>
+      </w:r>
+      <w:r>
+        <w:rPr>
+          <w:b/>
+          <w:bCs/>
+        </w:rPr>
+        <w:t>2</w:t>
+      </w:r>
+      <w:proofErr w:type="gramStart"/>
+      <w:r>
+        <w:rPr>
+          <w:b/>
+          <w:bCs/>
+        </w:rPr>
+        <w:t>:</w:t>
+      </w:r>
+      <w:r>
+        <w:t xml:space="preserve">  </w:t>
+      </w:r>
+      <w:r>
+        <w:t>Unzip</w:t>
+      </w:r>
+      <w:proofErr w:type="gramEnd"/>
+      <w:r>
+        <w:t xml:space="preserve"> the zip file Activity 11.4 Links to an external </w:t>
       </w:r>
       <w:proofErr w:type="gramStart"/>
       <w:r>
@@ -70,17 +137,94 @@
     </w:p>
     <w:p>
       <w:r>
+        <w:rPr>
+          <w:b/>
+          <w:bCs/>
+        </w:rPr>
+        <w:t xml:space="preserve">Step </w:t>
+      </w:r>
+      <w:r>
+        <w:rPr>
+          <w:b/>
+          <w:bCs/>
+        </w:rPr>
+        <w:t>3</w:t>
+      </w:r>
+      <w:r>
+        <w:rPr>
+          <w:b/>
+          <w:bCs/>
+        </w:rPr>
+        <w:t>:</w:t>
+      </w:r>
+      <w:r>
+        <w:t xml:space="preserve">  </w:t>
+      </w:r>
+      <w:r>
         <w:t>Point your browser to “http://localhost:5000” to see the application running. The My Books Site website will be displayed.</w:t>
       </w:r>
     </w:p>
     <w:p>
       <w:r>
+        <w:rPr>
+          <w:b/>
+          <w:bCs/>
+        </w:rPr>
+        <w:t xml:space="preserve">Step </w:t>
+      </w:r>
+      <w:r>
+        <w:rPr>
+          <w:b/>
+          <w:bCs/>
+        </w:rPr>
+        <w:t>4</w:t>
+      </w:r>
+      <w:r>
+        <w:rPr>
+          <w:b/>
+          <w:bCs/>
+        </w:rPr>
+        <w:t>:</w:t>
+      </w:r>
+      <w:r>
+        <w:t xml:space="preserve">  </w:t>
+      </w:r>
+      <w:r>
         <w:t>Point your browser to “http://localhost:5000/swagger”.</w:t>
       </w:r>
     </w:p>
     <w:p>
       <w:r>
-        <w:t xml:space="preserve">Select the books GET button to expand the books section. Select the “Try it out” option and then select the “Execute” button. Look at the </w:t>
+        <w:rPr>
+          <w:b/>
+          <w:bCs/>
+        </w:rPr>
+        <w:t xml:space="preserve">Step </w:t>
+      </w:r>
+      <w:r>
+        <w:rPr>
+          <w:b/>
+          <w:bCs/>
+        </w:rPr>
+        <w:t>5</w:t>
+      </w:r>
+      <w:proofErr w:type="gramStart"/>
+      <w:r>
+        <w:rPr>
+          <w:b/>
+          <w:bCs/>
+        </w:rPr>
+        <w:t>:</w:t>
+      </w:r>
+      <w:r>
+        <w:t xml:space="preserve">  </w:t>
+      </w:r>
+      <w:r>
+        <w:t>Select</w:t>
+      </w:r>
+      <w:proofErr w:type="gramEnd"/>
+      <w:r>
+        <w:t xml:space="preserve"> the books GET button to expand the books section. Select the “Try it out” option and then select the “Execute” button. Look at the </w:t>
       </w:r>
       <w:proofErr w:type="spellStart"/>
       <w:r>
@@ -93,7 +237,36 @@
     </w:p>
     <w:p>
       <w:r>
-        <w:t>Select POST to add a new book. Select “Try it out”, enter a book author and title, and select “Execute”. Look at the response and verify that the new book has been added.</w:t>
+        <w:rPr>
+          <w:b/>
+          <w:bCs/>
+        </w:rPr>
+        <w:t xml:space="preserve">Step </w:t>
+      </w:r>
+      <w:r>
+        <w:rPr>
+          <w:b/>
+          <w:bCs/>
+        </w:rPr>
+        <w:t>6</w:t>
+      </w:r>
+      <w:proofErr w:type="gramStart"/>
+      <w:r>
+        <w:rPr>
+          <w:b/>
+          <w:bCs/>
+        </w:rPr>
+        <w:t>:</w:t>
+      </w:r>
+      <w:r>
+        <w:t xml:space="preserve">  </w:t>
+      </w:r>
+      <w:r>
+        <w:t>Select</w:t>
+      </w:r>
+      <w:proofErr w:type="gramEnd"/>
+      <w:r>
+        <w:t xml:space="preserve"> POST to add a new book. Select “Try it out”, enter a book author and title, and select “Execute”. Look at the response and verify that the new book has been added.</w:t>
       </w:r>
     </w:p>
     <w:sectPr>

</xml_diff>

<commit_message>
Modify to reflect and add the screenshot of the activity.
</commit_message>
<xml_diff>
--- a/04_Coding_Activities/CA_11_4_Swagger_API/My_Solution/Required Coding Activity 11.4_Using Swagger to Expose an API.docx
+++ b/04_Coding_Activities/CA_11_4_Swagger_API/My_Solution/Required Coding Activity 11.4_Using Swagger to Expose an API.docx
@@ -3,9 +3,27 @@
 <w:document xmlns:wpc="http://schemas.microsoft.com/office/word/2010/wordprocessingCanvas" xmlns:cx="http://schemas.microsoft.com/office/drawing/2014/chartex" xmlns:cx1="http://schemas.microsoft.com/office/drawing/2015/9/8/chartex" xmlns:cx2="http://schemas.microsoft.com/office/drawing/2015/10/21/chartex" xmlns:cx3="http://schemas.microsoft.com/office/drawing/2016/5/9/chartex" xmlns:cx4="http://schemas.microsoft.com/office/drawing/2016/5/10/chartex" xmlns:cx5="http://schemas.microsoft.com/office/drawing/2016/5/11/chartex" xmlns:cx6="http://schemas.microsoft.com/office/drawing/2016/5/12/chartex" xmlns:cx7="http://schemas.microsoft.com/office/drawing/2016/5/13/chartex" xmlns:cx8="http://schemas.microsoft.com/office/drawing/2016/5/14/chartex" xmlns:mc="http://schemas.openxmlformats.org/markup-compatibility/2006" xmlns:aink="http://schemas.microsoft.com/office/drawing/2016/ink" xmlns:am3d="http://schemas.microsoft.com/office/drawing/2017/model3d" xmlns:o="urn:schemas-microsoft-com:office:office" xmlns:oel="http://schemas.microsoft.com/office/2019/extlst" xmlns:r="http://schemas.openxmlformats.org/officeDocument/2006/relationships" xmlns:m="http://schemas.openxmlformats.org/officeDocument/2006/math" xmlns:v="urn:schemas-microsoft-com:vml" xmlns:wp14="http://schemas.microsoft.com/office/word/2010/wordprocessingDrawing" xmlns:wp="http://schemas.openxmlformats.org/drawingml/2006/wordprocessingDrawing" xmlns:w10="urn:schemas-microsoft-com:office:word" xmlns:w="http://schemas.openxmlformats.org/wordprocessingml/2006/main" xmlns:w14="http://schemas.microsoft.com/office/word/2010/wordml" xmlns:w15="http://schemas.microsoft.com/office/word/2012/wordml" xmlns:w16cex="http://schemas.microsoft.com/office/word/2018/wordml/cex" xmlns:w16cid="http://schemas.microsoft.com/office/word/2016/wordml/cid" xmlns:w16="http://schemas.microsoft.com/office/word/2018/wordml" xmlns:w16du="http://schemas.microsoft.com/office/word/2023/wordml/word16du" xmlns:w16sdtdh="http://schemas.microsoft.com/office/word/2020/wordml/sdtdatahash" xmlns:w16sdtfl="http://schemas.microsoft.com/office/word/2024/wordml/sdtformatlock" xmlns:w16se="http://schemas.microsoft.com/office/word/2015/wordml/symex" xmlns:wpg="http://schemas.microsoft.com/office/word/2010/wordprocessingGroup" xmlns:wpi="http://schemas.microsoft.com/office/word/2010/wordprocessingInk" xmlns:wne="http://schemas.microsoft.com/office/word/2006/wordml" xmlns:wps="http://schemas.microsoft.com/office/word/2010/wordprocessingShape" mc:Ignorable="w14 w15 w16se w16cid w16 w16cex w16sdtdh w16sdtfl w16du wp14">
   <w:body>
     <w:p>
-      <w:r>
+      <w:pPr>
+        <w:rPr>
+          <w:sz w:val="36"/>
+          <w:szCs w:val="36"/>
+        </w:rPr>
+      </w:pPr>
+      <w:r>
+        <w:rPr>
+          <w:sz w:val="36"/>
+          <w:szCs w:val="36"/>
+        </w:rPr>
         <w:t>Required Coding Activity 11.4: Using Swagger to Expose an API</w:t>
       </w:r>
+    </w:p>
+    <w:p>
+      <w:pPr>
+        <w:rPr>
+          <w:b/>
+          <w:bCs/>
+        </w:rPr>
+      </w:pPr>
     </w:p>
     <w:p>
       <w:r>
@@ -137,6 +155,115 @@
     </w:p>
     <w:p>
       <w:r>
+        <w:drawing>
+          <wp:inline distT="0" distB="0" distL="0" distR="0" wp14:anchorId="3BACBE52" wp14:editId="20881E0D">
+            <wp:extent cx="4398096" cy="3008655"/>
+            <wp:effectExtent l="0" t="0" r="2540" b="1270"/>
+            <wp:docPr id="172530596" name="Picture 1"/>
+            <wp:cNvGraphicFramePr>
+              <a:graphicFrameLocks xmlns:a="http://schemas.openxmlformats.org/drawingml/2006/main" noChangeAspect="1"/>
+            </wp:cNvGraphicFramePr>
+            <a:graphic xmlns:a="http://schemas.openxmlformats.org/drawingml/2006/main">
+              <a:graphicData uri="http://schemas.openxmlformats.org/drawingml/2006/picture">
+                <pic:pic xmlns:pic="http://schemas.openxmlformats.org/drawingml/2006/picture">
+                  <pic:nvPicPr>
+                    <pic:cNvPr id="172530596" name=""/>
+                    <pic:cNvPicPr/>
+                  </pic:nvPicPr>
+                  <pic:blipFill>
+                    <a:blip r:embed="rId5"/>
+                    <a:stretch>
+                      <a:fillRect/>
+                    </a:stretch>
+                  </pic:blipFill>
+                  <pic:spPr>
+                    <a:xfrm>
+                      <a:off x="0" y="0"/>
+                      <a:ext cx="4402660" cy="3011777"/>
+                    </a:xfrm>
+                    <a:prstGeom prst="rect">
+                      <a:avLst/>
+                    </a:prstGeom>
+                  </pic:spPr>
+                </pic:pic>
+              </a:graphicData>
+            </a:graphic>
+          </wp:inline>
+        </w:drawing>
+      </w:r>
+    </w:p>
+    <w:p>
+      <w:r>
+        <w:rPr>
+          <w:b/>
+          <w:bCs/>
+        </w:rPr>
+        <w:lastRenderedPageBreak/>
+        <w:t xml:space="preserve">Step </w:t>
+      </w:r>
+      <w:r>
+        <w:rPr>
+          <w:b/>
+          <w:bCs/>
+        </w:rPr>
+        <w:t>3</w:t>
+      </w:r>
+      <w:r>
+        <w:rPr>
+          <w:b/>
+          <w:bCs/>
+        </w:rPr>
+        <w:t>:</w:t>
+      </w:r>
+      <w:r>
+        <w:t xml:space="preserve">  </w:t>
+      </w:r>
+      <w:r>
+        <w:t>Point your browser to “http://localhost:5000” to see the application running. The My Books Site website will be displayed.</w:t>
+      </w:r>
+    </w:p>
+    <w:p>
+      <w:r>
+        <w:drawing>
+          <wp:inline distT="0" distB="0" distL="0" distR="0" wp14:anchorId="627B4BF3" wp14:editId="4A6D52F4">
+            <wp:extent cx="5943600" cy="1532890"/>
+            <wp:effectExtent l="0" t="0" r="0" b="0"/>
+            <wp:docPr id="369819061" name="Picture 1"/>
+            <wp:cNvGraphicFramePr>
+              <a:graphicFrameLocks xmlns:a="http://schemas.openxmlformats.org/drawingml/2006/main" noChangeAspect="1"/>
+            </wp:cNvGraphicFramePr>
+            <a:graphic xmlns:a="http://schemas.openxmlformats.org/drawingml/2006/main">
+              <a:graphicData uri="http://schemas.openxmlformats.org/drawingml/2006/picture">
+                <pic:pic xmlns:pic="http://schemas.openxmlformats.org/drawingml/2006/picture">
+                  <pic:nvPicPr>
+                    <pic:cNvPr id="369819061" name=""/>
+                    <pic:cNvPicPr/>
+                  </pic:nvPicPr>
+                  <pic:blipFill>
+                    <a:blip r:embed="rId6"/>
+                    <a:stretch>
+                      <a:fillRect/>
+                    </a:stretch>
+                  </pic:blipFill>
+                  <pic:spPr>
+                    <a:xfrm>
+                      <a:off x="0" y="0"/>
+                      <a:ext cx="5943600" cy="1532890"/>
+                    </a:xfrm>
+                    <a:prstGeom prst="rect">
+                      <a:avLst/>
+                    </a:prstGeom>
+                  </pic:spPr>
+                </pic:pic>
+              </a:graphicData>
+            </a:graphic>
+          </wp:inline>
+        </w:drawing>
+      </w:r>
+    </w:p>
+    <w:p/>
+    <w:p>
+      <w:r>
         <w:rPr>
           <w:b/>
           <w:bCs/>
@@ -148,7 +275,7 @@
           <w:b/>
           <w:bCs/>
         </w:rPr>
-        <w:t>3</w:t>
+        <w:t>4</w:t>
       </w:r>
       <w:r>
         <w:rPr>
@@ -161,15 +288,56 @@
         <w:t xml:space="preserve">  </w:t>
       </w:r>
       <w:r>
-        <w:t>Point your browser to “http://localhost:5000” to see the application running. The My Books Site website will be displayed.</w:t>
-      </w:r>
-    </w:p>
+        <w:t>Point your browser to “http://localhost:5000/swagger”.</w:t>
+      </w:r>
+    </w:p>
+    <w:p>
+      <w:r>
+        <w:drawing>
+          <wp:inline distT="0" distB="0" distL="0" distR="0" wp14:anchorId="32B9D1B9" wp14:editId="667A1D7B">
+            <wp:extent cx="5943600" cy="4909185"/>
+            <wp:effectExtent l="0" t="0" r="0" b="5715"/>
+            <wp:docPr id="1853239796" name="Picture 1"/>
+            <wp:cNvGraphicFramePr>
+              <a:graphicFrameLocks xmlns:a="http://schemas.openxmlformats.org/drawingml/2006/main" noChangeAspect="1"/>
+            </wp:cNvGraphicFramePr>
+            <a:graphic xmlns:a="http://schemas.openxmlformats.org/drawingml/2006/main">
+              <a:graphicData uri="http://schemas.openxmlformats.org/drawingml/2006/picture">
+                <pic:pic xmlns:pic="http://schemas.openxmlformats.org/drawingml/2006/picture">
+                  <pic:nvPicPr>
+                    <pic:cNvPr id="1853239796" name=""/>
+                    <pic:cNvPicPr/>
+                  </pic:nvPicPr>
+                  <pic:blipFill>
+                    <a:blip r:embed="rId7"/>
+                    <a:stretch>
+                      <a:fillRect/>
+                    </a:stretch>
+                  </pic:blipFill>
+                  <pic:spPr>
+                    <a:xfrm>
+                      <a:off x="0" y="0"/>
+                      <a:ext cx="5943600" cy="4909185"/>
+                    </a:xfrm>
+                    <a:prstGeom prst="rect">
+                      <a:avLst/>
+                    </a:prstGeom>
+                  </pic:spPr>
+                </pic:pic>
+              </a:graphicData>
+            </a:graphic>
+          </wp:inline>
+        </w:drawing>
+      </w:r>
+    </w:p>
+    <w:p/>
     <w:p>
       <w:r>
         <w:rPr>
           <w:b/>
           <w:bCs/>
         </w:rPr>
+        <w:lastRenderedPageBreak/>
         <w:t xml:space="preserve">Step </w:t>
       </w:r>
       <w:r>
@@ -177,7 +345,7 @@
           <w:b/>
           <w:bCs/>
         </w:rPr>
-        <w:t>4</w:t>
+        <w:t>5</w:t>
       </w:r>
       <w:r>
         <w:rPr>
@@ -190,15 +358,70 @@
         <w:t xml:space="preserve">  </w:t>
       </w:r>
       <w:r>
-        <w:t>Point your browser to “http://localhost:5000/swagger”.</w:t>
-      </w:r>
-    </w:p>
+        <w:t xml:space="preserve">Select the books GET button to expand the books section. Select the “Try it out” option and then select the “Execute” button. Look at the </w:t>
+      </w:r>
+      <w:proofErr w:type="spellStart"/>
+      <w:r>
+        <w:t>cURL</w:t>
+      </w:r>
+      <w:proofErr w:type="spellEnd"/>
+      <w:r>
+        <w:t xml:space="preserve"> request and at the response section.</w:t>
+      </w:r>
+    </w:p>
+    <w:p>
+      <w:r>
+        <w:drawing>
+          <wp:inline distT="0" distB="0" distL="0" distR="0" wp14:anchorId="3005005E" wp14:editId="04709C54">
+            <wp:extent cx="5943600" cy="5420995"/>
+            <wp:effectExtent l="0" t="0" r="0" b="8255"/>
+            <wp:docPr id="684192333" name="Picture 1"/>
+            <wp:cNvGraphicFramePr>
+              <a:graphicFrameLocks xmlns:a="http://schemas.openxmlformats.org/drawingml/2006/main" noChangeAspect="1"/>
+            </wp:cNvGraphicFramePr>
+            <a:graphic xmlns:a="http://schemas.openxmlformats.org/drawingml/2006/main">
+              <a:graphicData uri="http://schemas.openxmlformats.org/drawingml/2006/picture">
+                <pic:pic xmlns:pic="http://schemas.openxmlformats.org/drawingml/2006/picture">
+                  <pic:nvPicPr>
+                    <pic:cNvPr id="684192333" name=""/>
+                    <pic:cNvPicPr/>
+                  </pic:nvPicPr>
+                  <pic:blipFill>
+                    <a:blip r:embed="rId8"/>
+                    <a:stretch>
+                      <a:fillRect/>
+                    </a:stretch>
+                  </pic:blipFill>
+                  <pic:spPr>
+                    <a:xfrm>
+                      <a:off x="0" y="0"/>
+                      <a:ext cx="5943600" cy="5420995"/>
+                    </a:xfrm>
+                    <a:prstGeom prst="rect">
+                      <a:avLst/>
+                    </a:prstGeom>
+                  </pic:spPr>
+                </pic:pic>
+              </a:graphicData>
+            </a:graphic>
+          </wp:inline>
+        </w:drawing>
+      </w:r>
+    </w:p>
+    <w:p/>
+    <w:p/>
+    <w:p/>
+    <w:p/>
+    <w:p/>
+    <w:p/>
+    <w:p/>
     <w:p>
       <w:r>
         <w:rPr>
           <w:b/>
           <w:bCs/>
         </w:rPr>
+        <w:lastRenderedPageBreak/>
         <w:t xml:space="preserve">Step </w:t>
       </w:r>
       <w:r>
@@ -206,7 +429,7 @@
           <w:b/>
           <w:bCs/>
         </w:rPr>
-        <w:t>5</w:t>
+        <w:t>6</w:t>
       </w:r>
       <w:proofErr w:type="gramStart"/>
       <w:r>
@@ -224,49 +447,137 @@
       </w:r>
       <w:proofErr w:type="gramEnd"/>
       <w:r>
-        <w:t xml:space="preserve"> the books GET button to expand the books section. Select the “Try it out” option and then select the “Execute” button. Look at the </w:t>
-      </w:r>
-      <w:proofErr w:type="spellStart"/>
-      <w:r>
-        <w:t>cURL</w:t>
-      </w:r>
-      <w:proofErr w:type="spellEnd"/>
-      <w:r>
-        <w:t xml:space="preserve"> request and at the response section.</w:t>
-      </w:r>
-    </w:p>
-    <w:p>
-      <w:r>
-        <w:rPr>
-          <w:b/>
-          <w:bCs/>
-        </w:rPr>
-        <w:t xml:space="preserve">Step </w:t>
-      </w:r>
-      <w:r>
-        <w:rPr>
-          <w:b/>
-          <w:bCs/>
-        </w:rPr>
-        <w:t>6</w:t>
-      </w:r>
-      <w:proofErr w:type="gramStart"/>
-      <w:r>
-        <w:rPr>
-          <w:b/>
-          <w:bCs/>
-        </w:rPr>
-        <w:t>:</w:t>
-      </w:r>
-      <w:r>
-        <w:t xml:space="preserve">  </w:t>
-      </w:r>
-      <w:r>
-        <w:t>Select</w:t>
-      </w:r>
-      <w:proofErr w:type="gramEnd"/>
-      <w:r>
         <w:t xml:space="preserve"> POST to add a new book. Select “Try it out”, enter a book author and title, and select “Execute”. Look at the response and verify that the new book has been added.</w:t>
+      </w:r>
+    </w:p>
+    <w:p>
+      <w:r>
+        <w:drawing>
+          <wp:inline distT="0" distB="0" distL="0" distR="0" wp14:anchorId="3D818D99" wp14:editId="5FE222D9">
+            <wp:extent cx="5943600" cy="4300855"/>
+            <wp:effectExtent l="0" t="0" r="0" b="4445"/>
+            <wp:docPr id="659179371" name="Picture 1"/>
+            <wp:cNvGraphicFramePr>
+              <a:graphicFrameLocks xmlns:a="http://schemas.openxmlformats.org/drawingml/2006/main" noChangeAspect="1"/>
+            </wp:cNvGraphicFramePr>
+            <a:graphic xmlns:a="http://schemas.openxmlformats.org/drawingml/2006/main">
+              <a:graphicData uri="http://schemas.openxmlformats.org/drawingml/2006/picture">
+                <pic:pic xmlns:pic="http://schemas.openxmlformats.org/drawingml/2006/picture">
+                  <pic:nvPicPr>
+                    <pic:cNvPr id="659179371" name=""/>
+                    <pic:cNvPicPr/>
+                  </pic:nvPicPr>
+                  <pic:blipFill>
+                    <a:blip r:embed="rId9"/>
+                    <a:stretch>
+                      <a:fillRect/>
+                    </a:stretch>
+                  </pic:blipFill>
+                  <pic:spPr>
+                    <a:xfrm>
+                      <a:off x="0" y="0"/>
+                      <a:ext cx="5943600" cy="4300855"/>
+                    </a:xfrm>
+                    <a:prstGeom prst="rect">
+                      <a:avLst/>
+                    </a:prstGeom>
+                  </pic:spPr>
+                </pic:pic>
+              </a:graphicData>
+            </a:graphic>
+          </wp:inline>
+        </w:drawing>
+      </w:r>
+    </w:p>
+    <w:p/>
+    <w:p/>
+    <w:p>
+      <w:r>
+        <w:t>Verify:</w:t>
+      </w:r>
+    </w:p>
+    <w:p>
+      <w:r>
+        <w:lastRenderedPageBreak/>
+        <w:drawing>
+          <wp:inline distT="0" distB="0" distL="0" distR="0" wp14:anchorId="1F83AB9E" wp14:editId="0BEA0132">
+            <wp:extent cx="5943600" cy="4639310"/>
+            <wp:effectExtent l="0" t="0" r="0" b="8890"/>
+            <wp:docPr id="1162510822" name="Picture 1"/>
+            <wp:cNvGraphicFramePr>
+              <a:graphicFrameLocks xmlns:a="http://schemas.openxmlformats.org/drawingml/2006/main" noChangeAspect="1"/>
+            </wp:cNvGraphicFramePr>
+            <a:graphic xmlns:a="http://schemas.openxmlformats.org/drawingml/2006/main">
+              <a:graphicData uri="http://schemas.openxmlformats.org/drawingml/2006/picture">
+                <pic:pic xmlns:pic="http://schemas.openxmlformats.org/drawingml/2006/picture">
+                  <pic:nvPicPr>
+                    <pic:cNvPr id="1162510822" name=""/>
+                    <pic:cNvPicPr/>
+                  </pic:nvPicPr>
+                  <pic:blipFill>
+                    <a:blip r:embed="rId10"/>
+                    <a:stretch>
+                      <a:fillRect/>
+                    </a:stretch>
+                  </pic:blipFill>
+                  <pic:spPr>
+                    <a:xfrm>
+                      <a:off x="0" y="0"/>
+                      <a:ext cx="5943600" cy="4639310"/>
+                    </a:xfrm>
+                    <a:prstGeom prst="rect">
+                      <a:avLst/>
+                    </a:prstGeom>
+                  </pic:spPr>
+                </pic:pic>
+              </a:graphicData>
+            </a:graphic>
+          </wp:inline>
+        </w:drawing>
+      </w:r>
+    </w:p>
+    <w:p>
+      <w:r>
+        <w:t>On the browser:</w:t>
+      </w:r>
+    </w:p>
+    <w:p>
+      <w:r>
+        <w:drawing>
+          <wp:inline distT="0" distB="0" distL="0" distR="0" wp14:anchorId="26E5BC3E" wp14:editId="437B279C">
+            <wp:extent cx="5943600" cy="1802765"/>
+            <wp:effectExtent l="0" t="0" r="0" b="6985"/>
+            <wp:docPr id="2044675136" name="Picture 1"/>
+            <wp:cNvGraphicFramePr>
+              <a:graphicFrameLocks xmlns:a="http://schemas.openxmlformats.org/drawingml/2006/main" noChangeAspect="1"/>
+            </wp:cNvGraphicFramePr>
+            <a:graphic xmlns:a="http://schemas.openxmlformats.org/drawingml/2006/main">
+              <a:graphicData uri="http://schemas.openxmlformats.org/drawingml/2006/picture">
+                <pic:pic xmlns:pic="http://schemas.openxmlformats.org/drawingml/2006/picture">
+                  <pic:nvPicPr>
+                    <pic:cNvPr id="2044675136" name=""/>
+                    <pic:cNvPicPr/>
+                  </pic:nvPicPr>
+                  <pic:blipFill>
+                    <a:blip r:embed="rId11"/>
+                    <a:stretch>
+                      <a:fillRect/>
+                    </a:stretch>
+                  </pic:blipFill>
+                  <pic:spPr>
+                    <a:xfrm>
+                      <a:off x="0" y="0"/>
+                      <a:ext cx="5943600" cy="1802765"/>
+                    </a:xfrm>
+                    <a:prstGeom prst="rect">
+                      <a:avLst/>
+                    </a:prstGeom>
+                  </pic:spPr>
+                </pic:pic>
+              </a:graphicData>
+            </a:graphic>
+          </wp:inline>
+        </w:drawing>
       </w:r>
     </w:p>
     <w:sectPr>

</xml_diff>